<commit_message>
modified the pure-fhir-facade-lab document- added github url in it
</commit_message>
<xml_diff>
--- a/Pure-FHIR-Facade-Lab.docx
+++ b/Pure-FHIR-Facade-Lab.docx
@@ -217,6 +217,38 @@
       </w:r>
       <w:r>
         <w:t>.</w:t>
+      </w:r>
+    </w:p>
+    <w:p>
+      <w:pPr>
+        <w:spacing w:after="160" w:line="276" w:lineRule="auto"/>
+      </w:pPr>
+      <w:proofErr w:type="spellStart"/>
+      <w:r>
+        <w:t>Github</w:t>
+      </w:r>
+      <w:proofErr w:type="spellEnd"/>
+      <w:r>
+        <w:t xml:space="preserve"> repository: </w:t>
+      </w:r>
+      <w:hyperlink r:id="rId7" w:history="1">
+        <w:r>
+          <w:rPr>
+            <w:rStyle w:val="Hyperlink"/>
+          </w:rPr>
+          <w:t>https://github.com/ajoshicurizent/hapi-jpa-fhir-facade-emr.git</w:t>
+        </w:r>
+      </w:hyperlink>
+      <w:r>
+        <w:t xml:space="preserve"> </w:t>
+      </w:r>
+    </w:p>
+    <w:p>
+      <w:pPr>
+        <w:spacing w:after="160" w:line="276" w:lineRule="auto"/>
+      </w:pPr>
+      <w:r>
+        <w:t xml:space="preserve">You can try out this code. You should have Java and Maven installed on your local machine. </w:t>
       </w:r>
     </w:p>
     <w:p>
@@ -654,7 +686,11 @@
         <w:t>Priya</w:t>
       </w:r>
       <w:r>
-        <w:t>, that only works after you write a search that reads the given_name column. HAPI will not discover that column. In this lab we wrote Patient identifier (</w:t>
+        <w:t xml:space="preserve">, that only works after you write a search that reads the given_name column. HAPI will not discover that column. In this lab </w:t>
+      </w:r>
+      <w:r>
+        <w:lastRenderedPageBreak/>
+        <w:t>we wrote Patient identifier (</w:t>
       </w:r>
       <w:proofErr w:type="spellStart"/>
       <w:r>
@@ -718,7 +754,6 @@
         <w:spacing w:after="80" w:line="276" w:lineRule="auto"/>
       </w:pPr>
       <w:r>
-        <w:lastRenderedPageBreak/>
         <w:t>Wires the facade: second DataSource to emrfacade, unregister HAPI's JPA Patient and Observation providers, register our providers.</w:t>
       </w:r>
     </w:p>
@@ -1495,6 +1530,7 @@
         <w:spacing w:after="80"/>
       </w:pPr>
       <w:r>
+        <w:lastRenderedPageBreak/>
         <w:t xml:space="preserve">Behind the door, the implementer reads ordinary SQL rows and </w:t>
       </w:r>
       <w:r>
@@ -1571,7 +1607,6 @@
         <w:spacing w:after="80"/>
       </w:pPr>
       <w:r>
-        <w:lastRenderedPageBreak/>
         <w:t xml:space="preserve">Bind </w:t>
       </w:r>
       <w:r>
@@ -2837,6 +2872,7 @@
           <w:sz w:val="20"/>
           <w:szCs w:val="20"/>
         </w:rPr>
+        <w:lastRenderedPageBreak/>
         <w:t>vital_sign</w:t>
       </w:r>
       <w:proofErr w:type="spellEnd"/>
@@ -2963,7 +2999,6 @@
           <w:sz w:val="20"/>
           <w:szCs w:val="20"/>
         </w:rPr>
-        <w:lastRenderedPageBreak/>
         <w:t>http://curizent.local/emr/mrn</w:t>
       </w:r>
     </w:p>
@@ -4280,6 +4315,7 @@
           <w:b/>
           <w:bCs/>
         </w:rPr>
+        <w:lastRenderedPageBreak/>
         <w:t>JPA and Hibernate are not on the Patient / Observation facade path.</w:t>
       </w:r>
       <w:r>
@@ -4338,7 +4374,6 @@
           <w:sz w:val="18"/>
           <w:szCs w:val="18"/>
         </w:rPr>
-        <w:lastRenderedPageBreak/>
         <w:t xml:space="preserve">Removing RESTful methods for: class </w:t>
       </w:r>
       <w:proofErr w:type="gramStart"/>
@@ -6305,6 +6340,7 @@
         <w:spacing w:after="160" w:line="276" w:lineRule="auto"/>
       </w:pPr>
       <w:r>
+        <w:lastRenderedPageBreak/>
         <w:t>Split to remember:</w:t>
       </w:r>
     </w:p>
@@ -6366,7 +6402,6 @@
         <w:spacing w:after="160" w:line="276" w:lineRule="auto"/>
       </w:pPr>
       <w:r>
-        <w:lastRenderedPageBreak/>
         <w:t xml:space="preserve">HAPI never sees </w:t>
       </w:r>
       <w:r>
@@ -8206,6 +8241,7 @@
         <w:spacing w:after="160" w:line="276" w:lineRule="auto"/>
       </w:pPr>
       <w:r>
+        <w:lastRenderedPageBreak/>
         <w:t xml:space="preserve">HAPI does </w:t>
       </w:r>
       <w:r>
@@ -8287,7 +8323,6 @@
         <w:spacing w:after="80"/>
       </w:pPr>
       <w:r>
-        <w:lastRenderedPageBreak/>
         <w:t xml:space="preserve">Read </w:t>
       </w:r>
       <w:proofErr w:type="spellStart"/>
@@ -9254,6 +9289,7 @@
           <w:sz w:val="26"/>
           <w:szCs w:val="26"/>
         </w:rPr>
+        <w:lastRenderedPageBreak/>
         <w:t>Step 2 — Create the EMR schema</w:t>
       </w:r>
     </w:p>
@@ -9319,7 +9355,6 @@
           <w:sz w:val="18"/>
           <w:szCs w:val="18"/>
         </w:rPr>
-        <w:lastRenderedPageBreak/>
         <w:t xml:space="preserve">SELECT </w:t>
       </w:r>
       <w:proofErr w:type="spellStart"/>
@@ -10661,6 +10696,7 @@
           <w:sz w:val="26"/>
           <w:szCs w:val="26"/>
         </w:rPr>
+        <w:lastRenderedPageBreak/>
         <w:t>Step 5 — Try the facade</w:t>
       </w:r>
     </w:p>
@@ -10687,7 +10723,6 @@
           <w:sz w:val="18"/>
           <w:szCs w:val="18"/>
         </w:rPr>
-        <w:lastRenderedPageBreak/>
         <w:t>GET http://localhost:8080/fhir/Patient/2</w:t>
       </w:r>
     </w:p>
@@ -12162,6 +12197,7 @@
           <w:sz w:val="18"/>
           <w:szCs w:val="18"/>
         </w:rPr>
+        <w:lastRenderedPageBreak/>
         <w:t xml:space="preserve"> </w:t>
       </w:r>
     </w:p>
@@ -12266,7 +12302,6 @@
           <w:sz w:val="18"/>
           <w:szCs w:val="18"/>
         </w:rPr>
-        <w:lastRenderedPageBreak/>
         <w:t xml:space="preserve">    </w:t>
       </w:r>
       <w:proofErr w:type="spellStart"/>
@@ -14176,6 +14211,7 @@
           <w:b/>
           <w:bCs/>
         </w:rPr>
+        <w:lastRenderedPageBreak/>
         <w:t xml:space="preserve">Chaining ≠ </w:t>
       </w:r>
       <w:proofErr w:type="spellStart"/>
@@ -14325,7 +14361,6 @@
           <w:b/>
           <w:bCs/>
         </w:rPr>
-        <w:lastRenderedPageBreak/>
         <w:t>CapabilityStatement</w:t>
       </w:r>
       <w:proofErr w:type="spellEnd"/>
@@ -14885,8 +14920,8 @@
       </w:pPr>
     </w:p>
     <w:sectPr>
-      <w:headerReference w:type="default" r:id="rId7"/>
-      <w:footerReference w:type="default" r:id="rId8"/>
+      <w:headerReference w:type="default" r:id="rId8"/>
+      <w:footerReference w:type="default" r:id="rId9"/>
       <w:pgSz w:w="11906" w:h="16838"/>
       <w:pgMar w:top="850" w:right="1000" w:bottom="850" w:left="1000" w:header="708" w:footer="708" w:gutter="0"/>
       <w:cols w:space="720"/>
@@ -16076,6 +16111,18 @@
       <w:szCs w:val="20"/>
     </w:rPr>
   </w:style>
+  <w:style w:type="character" w:styleId="UnresolvedMention">
+    <w:name w:val="Unresolved Mention"/>
+    <w:basedOn w:val="DefaultParagraphFont"/>
+    <w:uiPriority w:val="99"/>
+    <w:semiHidden/>
+    <w:unhideWhenUsed/>
+    <w:rsid w:val="000F4988"/>
+    <w:rPr>
+      <w:color w:val="605E5C"/>
+      <w:shd w:val="clear" w:color="auto" w:fill="E1DFDD"/>
+    </w:rPr>
+  </w:style>
 </w:styles>
 </file>
 

</xml_diff>